<commit_message>
Migra banco de dados para nuvem (Neon/PostgreSQL)
- db/connection.js: suporta dois modos por trás da mesma interface —
  DATABASE_URL definida usa Postgres real (Neon) via `pg`; vazia, cai
  automaticamente no PGlite local para desenvolvimento offline
- Fluxo completo validado ponta a ponta contra o banco em nuvem (login
  SSO, upload, OCR, confirmação de envio, RPA e persistência)
- Documentação atualizada (Tech Spec, spec 06, entrega Fase 5) refletindo
  a migração
</commit_message>
<xml_diff>
--- a/docs/entrega-fase5/GovFlow-AI-Documentacao-Fase5.docx
+++ b/docs/entrega-fase5/GovFlow-AI-Documentacao-Fase5.docx
@@ -3352,10 +3352,241 @@
       <w:r>
         <w:rPr>
           <w:b w:val="0"/>
-          <w:i/>
+          <w:i w:val="0"/>
           <w:sz w:val="22"/>
         </w:rPr>
-        <w:t>[SEÇÃO A ATUALIZAR APÓS MIGRAÇÃO — ver nota de acompanhamento]</w:t>
+        <w:t>O banco de dados está hospedado no Neon (PostgreSQL serverless em nuvem), atendendo ao requisito de implementação em provedor de Cloud Computing. A camada de acesso a dados foi desenhada desde o início para suportar dois modos por trás da mesma interface — um Postgres local embutido para desenvolvimento ágil sem dependência de rede, e o Postgres em nuvem para a entrega final — trocados automaticamente por uma única variável de ambiente (DATABASE_URL), sem qualquer alteração no restante do código da aplicação.</w:t>
+      </w:r>
+    </w:p>
+    <w:tbl>
+      <w:tblPr>
+        <w:tblStyle w:val="TableGrid"/>
+        <w:tblW w:type="auto" w:w="0"/>
+        <w:jc w:val="center"/>
+        <w:tblLook w:firstColumn="1" w:firstRow="1" w:lastColumn="0" w:lastRow="0" w:noHBand="0" w:noVBand="1" w:val="04A0"/>
+      </w:tblPr>
+      <w:tblGrid>
+        <w:gridCol w:w="4873"/>
+        <w:gridCol w:w="4873"/>
+      </w:tblGrid>
+      <w:tr>
+        <w:tc>
+          <w:tcPr>
+            <w:tcW w:type="dxa" w:w="2835"/>
+            <w:shd w:fill="2D5A27"/>
+          </w:tcPr>
+          <w:p>
+            <w:r/>
+            <w:r>
+              <w:rPr>
+                <w:rFonts w:ascii="Calibri" w:hAnsi="Calibri"/>
+                <w:b/>
+                <w:color w:val="FFFFFF"/>
+                <w:sz w:val="20"/>
+              </w:rPr>
+              <w:t>Item</w:t>
+            </w:r>
+          </w:p>
+        </w:tc>
+        <w:tc>
+          <w:tcPr>
+            <w:tcW w:type="dxa" w:w="6803"/>
+            <w:shd w:fill="2D5A27"/>
+          </w:tcPr>
+          <w:p>
+            <w:r/>
+            <w:r>
+              <w:rPr>
+                <w:rFonts w:ascii="Calibri" w:hAnsi="Calibri"/>
+                <w:b/>
+                <w:color w:val="FFFFFF"/>
+                <w:sz w:val="20"/>
+              </w:rPr>
+              <w:t>Detalhe</w:t>
+            </w:r>
+          </w:p>
+        </w:tc>
+      </w:tr>
+      <w:tr>
+        <w:tc>
+          <w:tcPr>
+            <w:tcW w:type="dxa" w:w="2835"/>
+          </w:tcPr>
+          <w:p>
+            <w:r/>
+            <w:r>
+              <w:rPr>
+                <w:rFonts w:ascii="Calibri" w:hAnsi="Calibri"/>
+                <w:b w:val="0"/>
+                <w:sz w:val="19"/>
+              </w:rPr>
+              <w:t>Provedor</w:t>
+            </w:r>
+          </w:p>
+        </w:tc>
+        <w:tc>
+          <w:tcPr>
+            <w:tcW w:type="dxa" w:w="6803"/>
+          </w:tcPr>
+          <w:p>
+            <w:r/>
+            <w:r>
+              <w:rPr>
+                <w:rFonts w:ascii="Calibri" w:hAnsi="Calibri"/>
+                <w:b w:val="0"/>
+                <w:sz w:val="19"/>
+              </w:rPr>
+              <w:t>Neon (PostgreSQL serverless)</w:t>
+            </w:r>
+          </w:p>
+        </w:tc>
+      </w:tr>
+      <w:tr>
+        <w:tc>
+          <w:tcPr>
+            <w:tcW w:type="dxa" w:w="2835"/>
+          </w:tcPr>
+          <w:p>
+            <w:r/>
+            <w:r>
+              <w:rPr>
+                <w:rFonts w:ascii="Calibri" w:hAnsi="Calibri"/>
+                <w:b w:val="0"/>
+                <w:sz w:val="19"/>
+              </w:rPr>
+              <w:t>Região</w:t>
+            </w:r>
+          </w:p>
+        </w:tc>
+        <w:tc>
+          <w:tcPr>
+            <w:tcW w:type="dxa" w:w="6803"/>
+          </w:tcPr>
+          <w:p>
+            <w:r/>
+            <w:r>
+              <w:rPr>
+                <w:rFonts w:ascii="Calibri" w:hAnsi="Calibri"/>
+                <w:b w:val="0"/>
+                <w:sz w:val="19"/>
+              </w:rPr>
+              <w:t>sa-east-1 (América do Sul)</w:t>
+            </w:r>
+          </w:p>
+        </w:tc>
+      </w:tr>
+      <w:tr>
+        <w:tc>
+          <w:tcPr>
+            <w:tcW w:type="dxa" w:w="2835"/>
+          </w:tcPr>
+          <w:p>
+            <w:r/>
+            <w:r>
+              <w:rPr>
+                <w:rFonts w:ascii="Calibri" w:hAnsi="Calibri"/>
+                <w:b w:val="0"/>
+                <w:sz w:val="19"/>
+              </w:rPr>
+              <w:t>Conexão</w:t>
+            </w:r>
+          </w:p>
+        </w:tc>
+        <w:tc>
+          <w:tcPr>
+            <w:tcW w:type="dxa" w:w="6803"/>
+          </w:tcPr>
+          <w:p>
+            <w:r/>
+            <w:r>
+              <w:rPr>
+                <w:rFonts w:ascii="Calibri" w:hAnsi="Calibri"/>
+                <w:b w:val="0"/>
+                <w:sz w:val="19"/>
+              </w:rPr>
+              <w:t>SSL obrigatório (sslmode=require), via connection pooler do Neon</w:t>
+            </w:r>
+          </w:p>
+        </w:tc>
+      </w:tr>
+      <w:tr>
+        <w:tc>
+          <w:tcPr>
+            <w:tcW w:type="dxa" w:w="2835"/>
+          </w:tcPr>
+          <w:p>
+            <w:r/>
+            <w:r>
+              <w:rPr>
+                <w:rFonts w:ascii="Calibri" w:hAnsi="Calibri"/>
+                <w:b w:val="0"/>
+                <w:sz w:val="19"/>
+              </w:rPr>
+              <w:t>Schema aplicado</w:t>
+            </w:r>
+          </w:p>
+        </w:tc>
+        <w:tc>
+          <w:tcPr>
+            <w:tcW w:type="dxa" w:w="6803"/>
+          </w:tcPr>
+          <w:p>
+            <w:r/>
+            <w:r>
+              <w:rPr>
+                <w:rFonts w:ascii="Calibri" w:hAnsi="Calibri"/>
+                <w:b w:val="0"/>
+                <w:sz w:val="19"/>
+              </w:rPr>
+              <w:t>Star Schema completo — 1 tabela fato + 5 dimensões + 2 views analíticas</w:t>
+            </w:r>
+          </w:p>
+        </w:tc>
+      </w:tr>
+      <w:tr>
+        <w:tc>
+          <w:tcPr>
+            <w:tcW w:type="dxa" w:w="2835"/>
+          </w:tcPr>
+          <w:p>
+            <w:r/>
+            <w:r>
+              <w:rPr>
+                <w:rFonts w:ascii="Calibri" w:hAnsi="Calibri"/>
+                <w:b w:val="0"/>
+                <w:sz w:val="19"/>
+              </w:rPr>
+              <w:t>Validação</w:t>
+            </w:r>
+          </w:p>
+        </w:tc>
+        <w:tc>
+          <w:tcPr>
+            <w:tcW w:type="dxa" w:w="6803"/>
+          </w:tcPr>
+          <w:p>
+            <w:r/>
+            <w:r>
+              <w:rPr>
+                <w:rFonts w:ascii="Calibri" w:hAnsi="Calibri"/>
+                <w:b w:val="0"/>
+                <w:sz w:val="19"/>
+              </w:rPr>
+              <w:t>Fluxo completo testado contra o banco em nuvem: login SSO, upload, extração OCR, confirmação de envio e execução do robô, com o resultado gravado e consultado de volta com sucesso</w:t>
+            </w:r>
+          </w:p>
+        </w:tc>
+      </w:tr>
+    </w:tbl>
+    <w:p/>
+    <w:p>
+      <w:r>
+        <w:rPr>
+          <w:i/>
+          <w:color w:val="5A6A57"/>
+          <w:sz w:val="19"/>
+        </w:rPr>
+        <w:t>Credenciais de conexão ficam em variável de ambiente (.env), nunca commitadas no repositório — o arquivo .env.example documenta as variáveis necessárias sem expor valores reais.</w:t>
       </w:r>
     </w:p>
     <w:p>

</xml_diff>